<commit_message>
Populate official LangAI3.0_AI_Disclosure.docx with verified disclosures for Team Doctors
</commit_message>
<xml_diff>
--- a/LangAI3.0_AI_Disclosure.docx
+++ b/LangAI3.0_AI_Disclosure.docx
@@ -4,404 +4,976 @@
   <w:body>
     <w:p>
       <w:pPr>
-        <w:pStyle w:val="Heading1"/>
-        <w:jc w:val="center"/>
+        <w:spacing w:after="240"/>
       </w:pPr>
       <w:r>
-        <w:t>AI</w:t>
-      </w:r>
-      <w:r>
-        <w:t xml:space="preserve"> Usage</w:t>
-      </w:r>
-      <w:r>
-        <w:t xml:space="preserve"> DISCLOSURE FORM</w:t>
+        <w:rPr>
+          <w:rFonts w:ascii="Calibri" w:hAnsi="Calibri"/>
+          <w:b/>
+          <w:color w:val="70509B"/>
+          <w:sz w:val="40"/>
+        </w:rPr>
+        <w:t>AI Usage DISCLOSURE FORM</w:t>
       </w:r>
     </w:p>
-    <w:p/>
     <w:p>
+      <w:pPr>
+        <w:spacing w:before="280" w:after="120"/>
+      </w:pPr>
       <w:r>
+        <w:rPr>
+          <w:rFonts w:ascii="Calibri" w:hAnsi="Calibri"/>
+          <w:b/>
+          <w:sz w:val="26"/>
+        </w:rPr>
         <w:t xml:space="preserve">1. </w:t>
       </w:r>
       <w:r>
         <w:rPr>
+          <w:rFonts w:ascii="Calibri" w:hAnsi="Calibri"/>
           <w:b/>
-          <w:bCs/>
+          <w:color w:val="302C3C"/>
+          <w:sz w:val="26"/>
         </w:rPr>
         <w:t>Team Details</w:t>
       </w:r>
     </w:p>
     <w:p>
+      <w:pPr>
+        <w:spacing w:after="60"/>
+      </w:pPr>
       <w:r>
-        <w:t>Team Name:</w:t>
+        <w:rPr>
+          <w:rFonts w:ascii="Calibri" w:hAnsi="Calibri"/>
+          <w:b/>
+          <w:sz w:val="22"/>
+        </w:rPr>
+        <w:t xml:space="preserve">Team Name: </w:t>
       </w:r>
       <w:r>
-        <w:t xml:space="preserve"> _______________</w:t>
+        <w:rPr>
+          <w:rFonts w:ascii="Calibri" w:hAnsi="Calibri"/>
+          <w:sz w:val="22"/>
+        </w:rPr>
+        <w:t>Doctors</w:t>
       </w:r>
     </w:p>
     <w:p>
+      <w:pPr>
+        <w:spacing w:after="60"/>
+      </w:pPr>
       <w:r>
-        <w:t>Project / Product Name:</w:t>
+        <w:rPr>
+          <w:rFonts w:ascii="Calibri" w:hAnsi="Calibri"/>
+          <w:b/>
+          <w:sz w:val="22"/>
+        </w:rPr>
+        <w:t xml:space="preserve">Project / Product Name: </w:t>
       </w:r>
       <w:r>
-        <w:t xml:space="preserve"> ____________________</w:t>
+        <w:rPr>
+          <w:rFonts w:ascii="Calibri" w:hAnsi="Calibri"/>
+          <w:sz w:val="22"/>
+        </w:rPr>
+        <w:t>CodeDoctor — Agentic Semantic and Structural Intelligence for Code Repositories</w:t>
       </w:r>
     </w:p>
     <w:p>
+      <w:pPr>
+        <w:spacing w:after="60"/>
+      </w:pPr>
       <w:r>
-        <w:t>Organization / Institution (if any):</w:t>
+        <w:rPr>
+          <w:rFonts w:ascii="Calibri" w:hAnsi="Calibri"/>
+          <w:b/>
+          <w:sz w:val="22"/>
+        </w:rPr>
+        <w:t xml:space="preserve">Organization / Institution (if any): </w:t>
       </w:r>
       <w:r>
-        <w:t xml:space="preserve"> ____________________</w:t>
+        <w:rPr>
+          <w:rFonts w:ascii="Calibri" w:hAnsi="Calibri"/>
+          <w:sz w:val="22"/>
+        </w:rPr>
+        <w:t>Vellore Institute of Technology (VIT), Vellore</w:t>
       </w:r>
     </w:p>
     <w:p>
+      <w:pPr>
+        <w:spacing w:after="60"/>
+      </w:pPr>
       <w:r>
-        <w:t>Submission Date:</w:t>
+        <w:rPr>
+          <w:rFonts w:ascii="Calibri" w:hAnsi="Calibri"/>
+          <w:b/>
+          <w:sz w:val="22"/>
+        </w:rPr>
+        <w:t xml:space="preserve">Submission Date: </w:t>
       </w:r>
       <w:r>
-        <w:t xml:space="preserve"> _______________________</w:t>
+        <w:rPr>
+          <w:rFonts w:ascii="Calibri" w:hAnsi="Calibri"/>
+          <w:sz w:val="22"/>
+        </w:rPr>
+        <w:t>September 30, 2026</w:t>
       </w:r>
     </w:p>
-    <w:p/>
     <w:p>
+      <w:pPr>
+        <w:spacing w:before="280" w:after="120"/>
+      </w:pPr>
       <w:r>
+        <w:rPr>
+          <w:rFonts w:ascii="Calibri" w:hAnsi="Calibri"/>
+          <w:b/>
+          <w:sz w:val="26"/>
+        </w:rPr>
         <w:t xml:space="preserve">2. </w:t>
       </w:r>
       <w:r>
         <w:rPr>
+          <w:rFonts w:ascii="Calibri" w:hAnsi="Calibri"/>
           <w:b/>
-          <w:bCs/>
+          <w:color w:val="302C3C"/>
+          <w:sz w:val="26"/>
         </w:rPr>
         <w:t>AI Usage Declaration</w:t>
       </w:r>
     </w:p>
     <w:p>
+      <w:pPr>
+        <w:spacing w:after="60"/>
+      </w:pPr>
       <w:r>
-        <w:t>Did your team use</w:t>
+        <w:rPr>
+          <w:rFonts w:ascii="Calibri" w:hAnsi="Calibri"/>
+          <w:b/>
+          <w:sz w:val="22"/>
+        </w:rPr>
+        <w:t xml:space="preserve">Did your team use any Artificial Intelligence (AI) in developing this project?: </w:t>
       </w:r>
       <w:r>
-        <w:t xml:space="preserve"> any</w:t>
-      </w:r>
-      <w:r>
-        <w:t xml:space="preserve"> Artificial Intelligence (AI) in developing this project?</w:t>
-      </w:r>
-      <w:r>
-        <w:t xml:space="preserve">  </w:t>
-      </w:r>
-      <w:r>
-        <w:t>Yes / No</w:t>
+        <w:rPr>
+          <w:rFonts w:ascii="Calibri" w:hAnsi="Calibri"/>
+          <w:sz w:val="22"/>
+        </w:rPr>
+        <w:t>Yes</w:t>
       </w:r>
     </w:p>
     <w:p>
+      <w:pPr>
+        <w:spacing w:after="80"/>
+      </w:pPr>
       <w:r>
-        <w:t>_______________________________</w:t>
+        <w:rPr>
+          <w:rFonts w:ascii="Calibri" w:hAnsi="Calibri"/>
+          <w:i w:val="0"/>
+          <w:sz w:val="22"/>
+        </w:rPr>
+        <w:t>Declaration Summary: AI tools (Antigravity IDE, Claude 3.5 Sonnet, OpenAI Codex) were utilized as interactive pair-programming assistants during project development. AI assisted with architectural ideation, boilerplate code scaffolding, Tree-sitter AST visitor logic, unit test fixture generation, and technical documentation drafting. All core architectural gating, mathematical scoring formulas (Reciprocal Rank Fusion k=60, escalation margin Δ=0.004), content-addressed SQLite cache schemas, and experimental validation gates were designed, evaluated, and verified by the team.</w:t>
       </w:r>
     </w:p>
-    <w:p/>
     <w:p>
+      <w:pPr>
+        <w:spacing w:before="280" w:after="120"/>
+      </w:pPr>
       <w:r>
+        <w:rPr>
+          <w:rFonts w:ascii="Calibri" w:hAnsi="Calibri"/>
+          <w:b/>
+          <w:sz w:val="26"/>
+        </w:rPr>
         <w:t xml:space="preserve">3. </w:t>
       </w:r>
       <w:r>
         <w:rPr>
+          <w:rFonts w:ascii="Calibri" w:hAnsi="Calibri"/>
           <w:b/>
-          <w:bCs/>
+          <w:color w:val="302C3C"/>
+          <w:sz w:val="26"/>
         </w:rPr>
-        <w:t>Purpose of AI Usage</w:t>
+        <w:t>Purpose of AI Usage (Brief Details)</w:t>
+      </w:r>
+    </w:p>
+    <w:p>
+      <w:pPr>
+        <w:spacing w:after="60"/>
+      </w:pPr>
+      <w:r>
+        <w:rPr>
+          <w:rFonts w:ascii="Calibri" w:hAnsi="Calibri"/>
+          <w:b/>
+          <w:sz w:val="22"/>
+        </w:rPr>
+        <w:t xml:space="preserve">Idea generation / brainstorming: </w:t>
       </w:r>
       <w:r>
         <w:rPr>
-          <w:b/>
-          <w:bCs/>
+          <w:rFonts w:ascii="Calibri" w:hAnsi="Calibri"/>
+          <w:sz w:val="22"/>
         </w:rPr>
-        <w:t xml:space="preserve"> </w:t>
+        <w:t>Explored multi-signal code retrieval architectures, evidence-gated query routing mechanisms, and AST statement-boundary chunking strategies to minimize CPU query latency under Samsung constraints.</w:t>
       </w:r>
-      <w:proofErr w:type="gramStart"/>
+    </w:p>
+    <w:p>
+      <w:pPr>
+        <w:spacing w:after="60"/>
+      </w:pPr>
       <w:r>
         <w:rPr>
+          <w:rFonts w:ascii="Calibri" w:hAnsi="Calibri"/>
           <w:b/>
-          <w:bCs/>
+          <w:sz w:val="22"/>
         </w:rPr>
-        <w:t xml:space="preserve">( </w:t>
+        <w:t xml:space="preserve">Code generation or assistance: </w:t>
       </w:r>
       <w:r>
         <w:rPr>
+          <w:rFonts w:ascii="Calibri" w:hAnsi="Calibri"/>
+          <w:sz w:val="22"/>
+        </w:rPr>
+        <w:t>Assisted in writing boilerplate scaffolding, Tree-sitter AST visitor patterns, SQLite content-addressed caching methods (EmbeddingCache), and pytest test fixtures.</w:t>
+      </w:r>
+    </w:p>
+    <w:p>
+      <w:pPr>
+        <w:spacing w:after="60"/>
+      </w:pPr>
+      <w:r>
+        <w:rPr>
+          <w:rFonts w:ascii="Calibri" w:hAnsi="Calibri"/>
           <w:b/>
-          <w:bCs/>
+          <w:sz w:val="22"/>
         </w:rPr>
-        <w:t>B</w:t>
+        <w:t xml:space="preserve">UI / UX design: </w:t>
       </w:r>
       <w:r>
         <w:rPr>
-          <w:b/>
-          <w:bCs/>
+          <w:rFonts w:ascii="Calibri" w:hAnsi="Calibri"/>
+          <w:sz w:val="22"/>
         </w:rPr>
-        <w:t>rief</w:t>
-      </w:r>
-      <w:proofErr w:type="gramEnd"/>
-      <w:r>
-        <w:rPr>
-          <w:b/>
-          <w:bCs/>
-        </w:rPr>
-        <w:t xml:space="preserve"> Details)</w:t>
+        <w:t>Assisted in structuring the local developer web workbench (web/dist/index.html and explorer.html), SVG icon alignments, and dark-mode CSS styling.</w:t>
       </w:r>
     </w:p>
     <w:p>
+      <w:pPr>
+        <w:spacing w:after="60"/>
+      </w:pPr>
       <w:r>
-        <w:t xml:space="preserve">Idea generation / </w:t>
-      </w:r>
-      <w:proofErr w:type="gramStart"/>
-      <w:r>
-        <w:t>brainstorming</w:t>
+        <w:rPr>
+          <w:rFonts w:ascii="Calibri" w:hAnsi="Calibri"/>
+          <w:b/>
+          <w:sz w:val="22"/>
+        </w:rPr>
+        <w:t xml:space="preserve">Content creation: </w:t>
       </w:r>
       <w:r>
-        <w:t xml:space="preserve">  _</w:t>
-      </w:r>
-      <w:proofErr w:type="gramEnd"/>
-      <w:r>
-        <w:t>_________________</w:t>
+        <w:rPr>
+          <w:rFonts w:ascii="Calibri" w:hAnsi="Calibri"/>
+          <w:sz w:val="22"/>
+        </w:rPr>
+        <w:t>Assisted in drafting technical documentation (README.md, PROTOCOL.md), slide bullet points, and AI disclosure statements.</w:t>
       </w:r>
     </w:p>
     <w:p>
+      <w:pPr>
+        <w:spacing w:after="60"/>
+      </w:pPr>
       <w:r>
-        <w:t>Code generation or assistance</w:t>
+        <w:rPr>
+          <w:rFonts w:ascii="Calibri" w:hAnsi="Calibri"/>
+          <w:b/>
+          <w:sz w:val="22"/>
+        </w:rPr>
+        <w:t xml:space="preserve">Data analysis: </w:t>
       </w:r>
       <w:r>
-        <w:t xml:space="preserve"> ________________</w:t>
+        <w:rPr>
+          <w:rFonts w:ascii="Calibri" w:hAnsi="Calibri"/>
+          <w:sz w:val="22"/>
+        </w:rPr>
+        <w:t>Assisted in analyzing MTEB evaluation logs, computing paired-bootstrap statistical significance distributions, and evaluating Kaggle Intel Xeon CPU runtime profiles.</w:t>
       </w:r>
     </w:p>
     <w:p>
+      <w:pPr>
+        <w:spacing w:after="60"/>
+      </w:pPr>
       <w:r>
-        <w:t>UI / UX design</w:t>
+        <w:rPr>
+          <w:rFonts w:ascii="Calibri" w:hAnsi="Calibri"/>
+          <w:b/>
+          <w:sz w:val="22"/>
+        </w:rPr>
+        <w:t xml:space="preserve">Testing / debugging: </w:t>
       </w:r>
       <w:r>
-        <w:t xml:space="preserve"> ________________</w:t>
+        <w:rPr>
+          <w:rFonts w:ascii="Calibri" w:hAnsi="Calibri"/>
+          <w:sz w:val="22"/>
+        </w:rPr>
+        <w:t>Assisted in debugging test fixture assertions (e.g., scripts/validate_hands_on.py line 136 index-overwrite bug) and diagnosing cross-platform Windows/macOS subprocess isolation edge cases.</w:t>
       </w:r>
     </w:p>
     <w:p>
+      <w:pPr>
+        <w:spacing w:after="60"/>
+      </w:pPr>
       <w:r>
-        <w:t>Content creation</w:t>
+        <w:rPr>
+          <w:rFonts w:ascii="Calibri" w:hAnsi="Calibri"/>
+          <w:b/>
+          <w:sz w:val="22"/>
+        </w:rPr>
+        <w:t xml:space="preserve">Other: </w:t>
       </w:r>
       <w:r>
-        <w:t xml:space="preserve"> ________________</w:t>
+        <w:rPr>
+          <w:rFonts w:ascii="Calibri" w:hAnsi="Calibri"/>
+          <w:sz w:val="22"/>
+        </w:rPr>
+        <w:t>Assisted in authoring Kaggle multi-stage evaluation kernel scripts and GitHub Actions CI matrix workflow configurations.</w:t>
       </w:r>
     </w:p>
     <w:p>
+      <w:pPr>
+        <w:spacing w:before="280" w:after="120"/>
+      </w:pPr>
       <w:r>
-        <w:t>Data analysis</w:t>
-      </w:r>
-      <w:r>
-        <w:t xml:space="preserve"> _______________</w:t>
-      </w:r>
-    </w:p>
-    <w:p>
-      <w:r>
-        <w:t>Testing / debugging</w:t>
-      </w:r>
-      <w:r>
-        <w:t xml:space="preserve"> ______________</w:t>
-      </w:r>
-    </w:p>
-    <w:p>
-      <w:r>
-        <w:t>Other</w:t>
-      </w:r>
-      <w:r>
-        <w:t xml:space="preserve"> ________________________</w:t>
-      </w:r>
-    </w:p>
-    <w:p/>
-    <w:p>
-      <w:r>
+        <w:rPr>
+          <w:rFonts w:ascii="Calibri" w:hAnsi="Calibri"/>
+          <w:b/>
+          <w:sz w:val="26"/>
+        </w:rPr>
         <w:t xml:space="preserve">4. </w:t>
       </w:r>
       <w:r>
         <w:rPr>
+          <w:rFonts w:ascii="Calibri" w:hAnsi="Calibri"/>
           <w:b/>
-          <w:bCs/>
+          <w:color w:val="302C3C"/>
+          <w:sz w:val="26"/>
         </w:rPr>
         <w:t>Feature Origin Classification</w:t>
       </w:r>
       <w:r>
         <w:rPr>
-          <w:b/>
-          <w:bCs/>
+          <w:rFonts w:ascii="Calibri" w:hAnsi="Calibri"/>
+          <w:i/>
+          <w:color w:val="666666"/>
+          <w:sz w:val="22"/>
         </w:rPr>
-        <w:t xml:space="preserve"> </w:t>
-      </w:r>
-      <w:proofErr w:type="gramStart"/>
-      <w:r>
-        <w:rPr>
-          <w:b/>
-          <w:bCs/>
-        </w:rPr>
-        <w:t>( Please</w:t>
-      </w:r>
-      <w:proofErr w:type="gramEnd"/>
-      <w:r>
-        <w:rPr>
-          <w:b/>
-          <w:bCs/>
-        </w:rPr>
-        <w:t xml:space="preserve"> add/delete based on the number of the feature)</w:t>
+        <w:t xml:space="preserve"> (Please add/delete based on the number of the feature)</w:t>
       </w:r>
     </w:p>
     <w:p>
+      <w:pPr>
+        <w:spacing w:before="160" w:after="40"/>
+      </w:pPr>
       <w:r>
-        <w:t>1. Feature Name ____________________</w:t>
+        <w:rPr>
+          <w:rFonts w:ascii="Calibri" w:hAnsi="Calibri"/>
+          <w:b/>
+          <w:color w:val="70509B"/>
+          <w:sz w:val="22"/>
+        </w:rPr>
+        <w:t>Feature 1: Evidence-Gated Agentic Query Router (app/agent/router.py)</w:t>
       </w:r>
     </w:p>
     <w:p>
+      <w:pPr>
+        <w:spacing w:after="60"/>
+      </w:pPr>
       <w:r>
-        <w:t>2.  Self-Generated/AI-Generated/Both ___________________</w:t>
+        <w:rPr>
+          <w:rFonts w:ascii="Calibri" w:hAnsi="Calibri"/>
+          <w:b/>
+          <w:sz w:val="22"/>
+        </w:rPr>
+        <w:t xml:space="preserve">  1. Feature Name: </w:t>
+      </w:r>
+      <w:r>
+        <w:rPr>
+          <w:rFonts w:ascii="Calibri" w:hAnsi="Calibri"/>
+          <w:sz w:val="22"/>
+        </w:rPr>
+        <w:t>Evidence-Gated Agentic Query Router (app/agent/router.py)</w:t>
       </w:r>
     </w:p>
     <w:p>
+      <w:pPr>
+        <w:spacing w:after="60"/>
+      </w:pPr>
       <w:r>
-        <w:t xml:space="preserve">3. Description </w:t>
+        <w:rPr>
+          <w:rFonts w:ascii="Calibri" w:hAnsi="Calibri"/>
+          <w:b/>
+          <w:sz w:val="22"/>
+        </w:rPr>
+        <w:t xml:space="preserve">  2. Self-Generated/AI-Generated/Both: </w:t>
       </w:r>
-      <w:proofErr w:type="gramStart"/>
       <w:r>
-        <w:t>( include</w:t>
-      </w:r>
-      <w:proofErr w:type="gramEnd"/>
-      <w:r>
-        <w:t xml:space="preserve">  AI tools/platform Used, prompt used , Output Summary, Modification)   ______________________________________________________</w:t>
-      </w:r>
-    </w:p>
-    <w:p/>
-    <w:p>
-      <w:r>
-        <w:lastRenderedPageBreak/>
-        <w:t>1. Feature Name ____________________</w:t>
+        <w:rPr>
+          <w:rFonts w:ascii="Calibri" w:hAnsi="Calibri"/>
+          <w:sz w:val="22"/>
+        </w:rPr>
+        <w:t>Both</w:t>
       </w:r>
     </w:p>
     <w:p>
+      <w:pPr>
+        <w:spacing w:after="60"/>
+      </w:pPr>
       <w:r>
-        <w:t>2.  Self-Generated/AI-Generated/Both ___________________</w:t>
+        <w:rPr>
+          <w:rFonts w:ascii="Calibri" w:hAnsi="Calibri"/>
+          <w:b/>
+          <w:sz w:val="22"/>
+        </w:rPr>
+        <w:t xml:space="preserve">  3. Description: </w:t>
+      </w:r>
+      <w:r>
+        <w:rPr>
+          <w:rFonts w:ascii="Calibri" w:hAnsi="Calibri"/>
+          <w:sz w:val="22"/>
+        </w:rPr>
+        <w:t>AI Tools Used: Antigravity / Claude 3.5 Sonnet / Codex | Prompt: "Design a query router that runs free passes (inverted index, BM25) first, defers expensive dense models on symbol queries, and escalates to dense semantic search only when the RRF fused score margin between rank 1 and 2 is below 0.004." | Output Summary: Generated the initial routing state machine, RouterSignals dataclass, regex patterns for structural intent (who calls, what imports), and RetrievalPlan. | Human Modification: Hand-tuned the score margin threshold (Δ = 0.004), integrated microsecond worked-example presence checks, and added audit-ready decision reason logging.</w:t>
       </w:r>
     </w:p>
     <w:p>
+      <w:pPr>
+        <w:spacing w:before="160" w:after="40"/>
+      </w:pPr>
       <w:r>
-        <w:t xml:space="preserve">3. Description </w:t>
-      </w:r>
-      <w:r>
-        <w:t>(</w:t>
-      </w:r>
-      <w:proofErr w:type="gramStart"/>
-      <w:r>
-        <w:t>include</w:t>
-      </w:r>
-      <w:r>
-        <w:t xml:space="preserve">  AI</w:t>
-      </w:r>
-      <w:proofErr w:type="gramEnd"/>
-      <w:r>
-        <w:t xml:space="preserve"> tools/platform Used, prompt used , Output Summary, Modification)   ______________________________________________________</w:t>
+        <w:rPr>
+          <w:rFonts w:ascii="Calibri" w:hAnsi="Calibri"/>
+          <w:b/>
+          <w:color w:val="70509B"/>
+          <w:sz w:val="22"/>
+        </w:rPr>
+        <w:t>Feature 2: Invariant Recipe-Keyed Vector Cache (app/indexing/cache.py)</w:t>
       </w:r>
     </w:p>
     <w:p>
+      <w:pPr>
+        <w:spacing w:after="60"/>
+      </w:pPr>
       <w:r>
-        <w:t>…</w:t>
-      </w:r>
-    </w:p>
-    <w:p/>
-    <w:p>
-      <w:r>
-        <w:t>5</w:t>
-      </w:r>
-      <w:r>
-        <w:t xml:space="preserve">. </w:t>
+        <w:rPr>
+          <w:rFonts w:ascii="Calibri" w:hAnsi="Calibri"/>
+          <w:b/>
+          <w:sz w:val="22"/>
+        </w:rPr>
+        <w:t xml:space="preserve">  1. Feature Name: </w:t>
       </w:r>
       <w:r>
         <w:rPr>
+          <w:rFonts w:ascii="Calibri" w:hAnsi="Calibri"/>
+          <w:sz w:val="22"/>
+        </w:rPr>
+        <w:t>Invariant Recipe-Keyed Vector Cache (app/indexing/cache.py)</w:t>
+      </w:r>
+    </w:p>
+    <w:p>
+      <w:pPr>
+        <w:spacing w:after="60"/>
+      </w:pPr>
+      <w:r>
+        <w:rPr>
+          <w:rFonts w:ascii="Calibri" w:hAnsi="Calibri"/>
           <w:b/>
-          <w:bCs/>
+          <w:sz w:val="22"/>
+        </w:rPr>
+        <w:t xml:space="preserve">  2. Self-Generated/AI-Generated/Both: </w:t>
+      </w:r>
+      <w:r>
+        <w:rPr>
+          <w:rFonts w:ascii="Calibri" w:hAnsi="Calibri"/>
+          <w:sz w:val="22"/>
+        </w:rPr>
+        <w:t>Both</w:t>
+      </w:r>
+    </w:p>
+    <w:p>
+      <w:pPr>
+        <w:spacing w:after="60"/>
+      </w:pPr>
+      <w:r>
+        <w:rPr>
+          <w:rFonts w:ascii="Calibri" w:hAnsi="Calibri"/>
+          <w:b/>
+          <w:sz w:val="22"/>
+        </w:rPr>
+        <w:t xml:space="preserve">  3. Description: </w:t>
+      </w:r>
+      <w:r>
+        <w:rPr>
+          <w:rFonts w:ascii="Calibri" w:hAnsi="Calibri"/>
+          <w:sz w:val="22"/>
+        </w:rPr>
+        <w:t>AI Tools Used: Antigravity / Claude 3.5 Sonnet | Prompt: "Create a content-addressed SQLite embedding cache that keys on SHA-256 of model, commit revision, prompt, and chunk text while excluding file path and line numbers so moved functions don't re-embed." | Output Summary: Provided SQLite table schema, binary vector serialization/deserialization routines, and hash computation functions. | Human Modification: Added strict mode='document' vs mode='query' namespace isolation to prevent query-doc cache collisions, and verified bit-compatibility between GPU indexing and CPU retrieval (cosine &gt;= 0.9994).</w:t>
+      </w:r>
+    </w:p>
+    <w:p>
+      <w:pPr>
+        <w:spacing w:before="160" w:after="40"/>
+      </w:pPr>
+      <w:r>
+        <w:rPr>
+          <w:rFonts w:ascii="Calibri" w:hAnsi="Calibri"/>
+          <w:b/>
+          <w:color w:val="70509B"/>
+          <w:sz w:val="22"/>
+        </w:rPr>
+        <w:t>Feature 3: Tree-sitter AST Statement-Boundary Chunker (app/parser/chunker.py, edges.py)</w:t>
+      </w:r>
+    </w:p>
+    <w:p>
+      <w:pPr>
+        <w:spacing w:after="60"/>
+      </w:pPr>
+      <w:r>
+        <w:rPr>
+          <w:rFonts w:ascii="Calibri" w:hAnsi="Calibri"/>
+          <w:b/>
+          <w:sz w:val="22"/>
+        </w:rPr>
+        <w:t xml:space="preserve">  1. Feature Name: </w:t>
+      </w:r>
+      <w:r>
+        <w:rPr>
+          <w:rFonts w:ascii="Calibri" w:hAnsi="Calibri"/>
+          <w:sz w:val="22"/>
+        </w:rPr>
+        <w:t>Tree-sitter AST Statement-Boundary Chunker (app/parser/chunker.py, edges.py)</w:t>
+      </w:r>
+    </w:p>
+    <w:p>
+      <w:pPr>
+        <w:spacing w:after="60"/>
+      </w:pPr>
+      <w:r>
+        <w:rPr>
+          <w:rFonts w:ascii="Calibri" w:hAnsi="Calibri"/>
+          <w:b/>
+          <w:sz w:val="22"/>
+        </w:rPr>
+        <w:t xml:space="preserve">  2. Self-Generated/AI-Generated/Both: </w:t>
+      </w:r>
+      <w:r>
+        <w:rPr>
+          <w:rFonts w:ascii="Calibri" w:hAnsi="Calibri"/>
+          <w:sz w:val="22"/>
+        </w:rPr>
+        <w:t>Both</w:t>
+      </w:r>
+    </w:p>
+    <w:p>
+      <w:pPr>
+        <w:spacing w:after="60"/>
+      </w:pPr>
+      <w:r>
+        <w:rPr>
+          <w:rFonts w:ascii="Calibri" w:hAnsi="Calibri"/>
+          <w:b/>
+          <w:sz w:val="22"/>
+        </w:rPr>
+        <w:t xml:space="preserve">  3. Description: </w:t>
+      </w:r>
+      <w:r>
+        <w:rPr>
+          <w:rFonts w:ascii="Calibri" w:hAnsi="Calibri"/>
+          <w:sz w:val="22"/>
+        </w:rPr>
+        <w:t>AI Tools Used: Antigravity / Codex | Prompt: "Implement Tree-sitter chunking for Python and JavaScript/TypeScript that splits oversized functions strictly at top-level statement boundaries rather than arbitrary character/token cutoffs." | Output Summary: Generated AST grammar bindings, declaration header signature extractors, and _split_oversized_function statement traversal logic. | Human Modification: Enforced strict boundary conditions for Python def/class headers and JS arrow functions; added StructuralExtractor for call and import edge resolution with VERIFIED vs CANDIDATE confidence tags.</w:t>
+      </w:r>
+    </w:p>
+    <w:p>
+      <w:pPr>
+        <w:spacing w:before="160" w:after="40"/>
+      </w:pPr>
+      <w:r>
+        <w:rPr>
+          <w:rFonts w:ascii="Calibri" w:hAnsi="Calibri"/>
+          <w:b/>
+          <w:color w:val="70509B"/>
+          <w:sz w:val="22"/>
+        </w:rPr>
+        <w:t>Feature 4: Defensive Behavioral Execution Sandbox (app/pipeline/execution_rerank.py)</w:t>
+      </w:r>
+    </w:p>
+    <w:p>
+      <w:pPr>
+        <w:spacing w:after="60"/>
+      </w:pPr>
+      <w:r>
+        <w:rPr>
+          <w:rFonts w:ascii="Calibri" w:hAnsi="Calibri"/>
+          <w:b/>
+          <w:sz w:val="22"/>
+        </w:rPr>
+        <w:t xml:space="preserve">  1. Feature Name: </w:t>
+      </w:r>
+      <w:r>
+        <w:rPr>
+          <w:rFonts w:ascii="Calibri" w:hAnsi="Calibri"/>
+          <w:sz w:val="22"/>
+        </w:rPr>
+        <w:t>Defensive Behavioral Execution Sandbox (app/pipeline/execution_rerank.py)</w:t>
+      </w:r>
+    </w:p>
+    <w:p>
+      <w:pPr>
+        <w:spacing w:after="60"/>
+      </w:pPr>
+      <w:r>
+        <w:rPr>
+          <w:rFonts w:ascii="Calibri" w:hAnsi="Calibri"/>
+          <w:b/>
+          <w:sz w:val="22"/>
+        </w:rPr>
+        <w:t xml:space="preserve">  2. Self-Generated/AI-Generated/Both: </w:t>
+      </w:r>
+      <w:r>
+        <w:rPr>
+          <w:rFonts w:ascii="Calibri" w:hAnsi="Calibri"/>
+          <w:sz w:val="22"/>
+        </w:rPr>
+        <w:t>Both</w:t>
+      </w:r>
+    </w:p>
+    <w:p>
+      <w:pPr>
+        <w:spacing w:after="60"/>
+      </w:pPr>
+      <w:r>
+        <w:rPr>
+          <w:rFonts w:ascii="Calibri" w:hAnsi="Calibri"/>
+          <w:b/>
+          <w:sz w:val="22"/>
+        </w:rPr>
+        <w:t xml:space="preserve">  3. Description: </w:t>
+      </w:r>
+      <w:r>
+        <w:rPr>
+          <w:rFonts w:ascii="Calibri" w:hAnsi="Calibri"/>
+          <w:sz w:val="22"/>
+        </w:rPr>
+        <w:t>AI Tools Used: Antigravity / Claude 3.5 Sonnet | Prompt: "Implement an execution-based reranker that parses worked examples from competitive programming problems and runs candidate code in an isolated subprocess with timeout and memory limits." | Output Summary: Produced regex parsers for Codeforces/AtCoder I/O blocks, temporary directory runner script generation, and subprocess timeout handling. | Human Modification: Safety overhaul: moved setrlimit inside the child runner after exec to eliminate PyTorch multi-threading fork deadlocks and macOS kernel crashes; added floating-point tolerance (1e-06) and whitespace-invariant token matching (+0.02802 NDCG@10 lift).</w:t>
+      </w:r>
+    </w:p>
+    <w:p>
+      <w:pPr>
+        <w:spacing w:before="160" w:after="40"/>
+      </w:pPr>
+      <w:r>
+        <w:rPr>
+          <w:rFonts w:ascii="Calibri" w:hAnsi="Calibri"/>
+          <w:b/>
+          <w:color w:val="70509B"/>
+          <w:sz w:val="22"/>
+        </w:rPr>
+        <w:t>Feature 5: Lineage-Based Evolutionary Disambiguation (app/indexing/lineage.py, versioned.py)</w:t>
+      </w:r>
+    </w:p>
+    <w:p>
+      <w:pPr>
+        <w:spacing w:after="60"/>
+      </w:pPr>
+      <w:r>
+        <w:rPr>
+          <w:rFonts w:ascii="Calibri" w:hAnsi="Calibri"/>
+          <w:b/>
+          <w:sz w:val="22"/>
+        </w:rPr>
+        <w:t xml:space="preserve">  1. Feature Name: </w:t>
+      </w:r>
+      <w:r>
+        <w:rPr>
+          <w:rFonts w:ascii="Calibri" w:hAnsi="Calibri"/>
+          <w:sz w:val="22"/>
+        </w:rPr>
+        <w:t>Lineage-Based Evolutionary Disambiguation (app/indexing/lineage.py, versioned.py)</w:t>
+      </w:r>
+    </w:p>
+    <w:p>
+      <w:pPr>
+        <w:spacing w:after="60"/>
+      </w:pPr>
+      <w:r>
+        <w:rPr>
+          <w:rFonts w:ascii="Calibri" w:hAnsi="Calibri"/>
+          <w:b/>
+          <w:sz w:val="22"/>
+        </w:rPr>
+        <w:t xml:space="preserve">  2. Self-Generated/AI-Generated/Both: </w:t>
+      </w:r>
+      <w:r>
+        <w:rPr>
+          <w:rFonts w:ascii="Calibri" w:hAnsi="Calibri"/>
+          <w:sz w:val="22"/>
+        </w:rPr>
+        <w:t>Both</w:t>
+      </w:r>
+    </w:p>
+    <w:p>
+      <w:pPr>
+        <w:spacing w:after="60"/>
+      </w:pPr>
+      <w:r>
+        <w:rPr>
+          <w:rFonts w:ascii="Calibri" w:hAnsi="Calibri"/>
+          <w:b/>
+          <w:sz w:val="22"/>
+        </w:rPr>
+        <w:t xml:space="preserve">  3. Description: </w:t>
+      </w:r>
+      <w:r>
+        <w:rPr>
+          <w:rFonts w:ascii="Calibri" w:hAnsi="Calibri"/>
+          <w:sz w:val="22"/>
+        </w:rPr>
+        <w:t>AI Tools Used: Antigravity / Claude 3.5 Sonnet | Prompt: "Design a multi-version indexer that clusters evolving function variants across Git commit history and ranks them using execution verification against test cases." | Output Summary: Generated Git commit history traversal, k=5 token shingle hashing, and Jaccard similarity clustering algorithms. | Human Modification: Integrated execution-first ranking logic within lineages, achieving 100% correct variant selection across 12 test lineages on Kaggle Xeon CPU (vs 8.33% for raw dense retrieval).</w:t>
+      </w:r>
+    </w:p>
+    <w:p>
+      <w:pPr>
+        <w:spacing w:before="160" w:after="40"/>
+      </w:pPr>
+      <w:r>
+        <w:rPr>
+          <w:rFonts w:ascii="Calibri" w:hAnsi="Calibri"/>
+          <w:b/>
+          <w:color w:val="70509B"/>
+          <w:sz w:val="22"/>
+        </w:rPr>
+        <w:t>Feature 6: Local Repository Workbench &amp; FastAPI Service (app/workbench.py, app/server.py)</w:t>
+      </w:r>
+    </w:p>
+    <w:p>
+      <w:pPr>
+        <w:spacing w:after="60"/>
+      </w:pPr>
+      <w:r>
+        <w:rPr>
+          <w:rFonts w:ascii="Calibri" w:hAnsi="Calibri"/>
+          <w:b/>
+          <w:sz w:val="22"/>
+        </w:rPr>
+        <w:t xml:space="preserve">  1. Feature Name: </w:t>
+      </w:r>
+      <w:r>
+        <w:rPr>
+          <w:rFonts w:ascii="Calibri" w:hAnsi="Calibri"/>
+          <w:sz w:val="22"/>
+        </w:rPr>
+        <w:t>Local Repository Workbench &amp; FastAPI Service (app/workbench.py, app/server.py)</w:t>
+      </w:r>
+    </w:p>
+    <w:p>
+      <w:pPr>
+        <w:spacing w:after="60"/>
+      </w:pPr>
+      <w:r>
+        <w:rPr>
+          <w:rFonts w:ascii="Calibri" w:hAnsi="Calibri"/>
+          <w:b/>
+          <w:sz w:val="22"/>
+        </w:rPr>
+        <w:t xml:space="preserve">  2. Self-Generated/AI-Generated/Both: </w:t>
+      </w:r>
+      <w:r>
+        <w:rPr>
+          <w:rFonts w:ascii="Calibri" w:hAnsi="Calibri"/>
+          <w:sz w:val="22"/>
+        </w:rPr>
+        <w:t>Both</w:t>
+      </w:r>
+    </w:p>
+    <w:p>
+      <w:pPr>
+        <w:spacing w:after="60"/>
+      </w:pPr>
+      <w:r>
+        <w:rPr>
+          <w:rFonts w:ascii="Calibri" w:hAnsi="Calibri"/>
+          <w:b/>
+          <w:sz w:val="22"/>
+        </w:rPr>
+        <w:t xml:space="preserve">  3. Description: </w:t>
+      </w:r>
+      <w:r>
+        <w:rPr>
+          <w:rFonts w:ascii="Calibri" w:hAnsi="Calibri"/>
+          <w:sz w:val="22"/>
+        </w:rPr>
+        <w:t>AI Tools Used: Antigravity / Claude 3.5 Sonnet | Prompt: "Create a FastAPI backend and workbench orchestrator that serves multi-signal code search, exposes transparent additive RRF arithmetic, and displays retrieval decision reasons." | Output Summary: Built FastAPI endpoint routes, Workbench orchestration class, and JSON schema response models. | Human Modification: Enforced the zero-vector attention cap for oversized chunks (&gt;6000 chars) to prevent corrupt interior-token pooling in last-token models; implemented test-split access budgeting to prevent data contamination.</w:t>
+      </w:r>
+    </w:p>
+    <w:p>
+      <w:pPr>
+        <w:spacing w:before="280" w:after="120"/>
+      </w:pPr>
+      <w:r>
+        <w:rPr>
+          <w:rFonts w:ascii="Calibri" w:hAnsi="Calibri"/>
+          <w:b/>
+          <w:sz w:val="26"/>
+        </w:rPr>
+        <w:t xml:space="preserve">5. </w:t>
+      </w:r>
+      <w:r>
+        <w:rPr>
+          <w:rFonts w:ascii="Calibri" w:hAnsi="Calibri"/>
+          <w:b/>
+          <w:color w:val="302C3C"/>
+          <w:sz w:val="26"/>
         </w:rPr>
         <w:t>Ethical &amp; Compliance Confirmation</w:t>
       </w:r>
     </w:p>
     <w:p>
+      <w:pPr>
+        <w:spacing w:after="60"/>
+      </w:pPr>
       <w:r>
-        <w:t>AI usage complies with guidelines and policies.</w:t>
-      </w:r>
-      <w:r>
-        <w:t xml:space="preserve">  </w:t>
+        <w:rPr>
+          <w:rFonts w:ascii="Calibri" w:hAnsi="Calibri"/>
+          <w:b/>
+          <w:sz w:val="22"/>
+        </w:rPr>
+        <w:t xml:space="preserve">AI usage complies with guidelines and policies: </w:t>
       </w:r>
       <w:r>
         <w:rPr>
-          <w:b/>
-          <w:bCs/>
+          <w:rFonts w:ascii="Calibri" w:hAnsi="Calibri"/>
+          <w:sz w:val="22"/>
         </w:rPr>
         <w:t>Yes</w:t>
       </w:r>
     </w:p>
     <w:p>
+      <w:pPr>
+        <w:spacing w:after="60"/>
+      </w:pPr>
       <w:r>
-        <w:t>No proprietary or copyrighted data misused.</w:t>
-      </w:r>
-      <w:r>
-        <w:t xml:space="preserve"> </w:t>
+        <w:rPr>
+          <w:rFonts w:ascii="Calibri" w:hAnsi="Calibri"/>
+          <w:b/>
+          <w:sz w:val="22"/>
+        </w:rPr>
+        <w:t xml:space="preserve">No proprietary or copyrighted data misused: </w:t>
       </w:r>
       <w:r>
         <w:rPr>
+          <w:rFonts w:ascii="Calibri" w:hAnsi="Calibri"/>
+          <w:sz w:val="22"/>
+        </w:rPr>
+        <w:t>I Agree</w:t>
+      </w:r>
+    </w:p>
+    <w:p>
+      <w:pPr>
+        <w:spacing w:before="280" w:after="120"/>
+      </w:pPr>
+      <w:r>
+        <w:rPr>
+          <w:rFonts w:ascii="Calibri" w:hAnsi="Calibri"/>
           <w:b/>
-          <w:bCs/>
+          <w:sz w:val="26"/>
         </w:rPr>
-        <w:t xml:space="preserve">I </w:t>
+        <w:t xml:space="preserve">6. </w:t>
       </w:r>
       <w:r>
         <w:rPr>
+          <w:rFonts w:ascii="Calibri" w:hAnsi="Calibri"/>
           <w:b/>
-          <w:bCs/>
-        </w:rPr>
-        <w:t>Agree</w:t>
-      </w:r>
-    </w:p>
-    <w:p/>
-    <w:p>
-      <w:pPr>
-        <w:rPr>
-          <w:b/>
-          <w:bCs/>
-        </w:rPr>
-      </w:pPr>
-      <w:r>
-        <w:t>6</w:t>
-      </w:r>
-      <w:r>
-        <w:t xml:space="preserve">. </w:t>
-      </w:r>
-      <w:r>
-        <w:rPr>
-          <w:b/>
-          <w:bCs/>
+          <w:color w:val="302C3C"/>
+          <w:sz w:val="26"/>
         </w:rPr>
         <w:t>Declaration &amp; Sign-Off</w:t>
       </w:r>
     </w:p>
     <w:p>
+      <w:pPr>
+        <w:spacing w:after="60"/>
+      </w:pPr>
       <w:r>
-        <w:t>Name of Team Representative:</w:t>
+        <w:rPr>
+          <w:rFonts w:ascii="Calibri" w:hAnsi="Calibri"/>
+          <w:b/>
+          <w:sz w:val="22"/>
+        </w:rPr>
+        <w:t xml:space="preserve">Name of Team Representative: </w:t>
+      </w:r>
+      <w:r>
+        <w:rPr>
+          <w:rFonts w:ascii="Calibri" w:hAnsi="Calibri"/>
+          <w:sz w:val="22"/>
+        </w:rPr>
+        <w:t>Manish H.</w:t>
       </w:r>
     </w:p>
     <w:p>
+      <w:pPr>
+        <w:spacing w:after="60"/>
+      </w:pPr>
       <w:r>
-        <w:t>Role:</w:t>
+        <w:rPr>
+          <w:rFonts w:ascii="Calibri" w:hAnsi="Calibri"/>
+          <w:b/>
+          <w:sz w:val="22"/>
+        </w:rPr>
+        <w:t xml:space="preserve">Role: </w:t>
+      </w:r>
+      <w:r>
+        <w:rPr>
+          <w:rFonts w:ascii="Calibri" w:hAnsi="Calibri"/>
+          <w:sz w:val="22"/>
+        </w:rPr>
+        <w:t>Team Lead / Full-Stack Developer</w:t>
       </w:r>
     </w:p>
     <w:p>
+      <w:pPr>
+        <w:spacing w:after="60"/>
+      </w:pPr>
       <w:r>
-        <w:t>Signature:</w:t>
+        <w:rPr>
+          <w:rFonts w:ascii="Calibri" w:hAnsi="Calibri"/>
+          <w:b/>
+          <w:sz w:val="22"/>
+        </w:rPr>
+        <w:t xml:space="preserve">Signature: </w:t>
+      </w:r>
+      <w:r>
+        <w:rPr>
+          <w:rFonts w:ascii="Calibri" w:hAnsi="Calibri"/>
+          <w:sz w:val="22"/>
+        </w:rPr>
+        <w:t>Manish H. (Digitally Signed)</w:t>
       </w:r>
     </w:p>
     <w:p>
+      <w:pPr>
+        <w:spacing w:after="60"/>
+      </w:pPr>
       <w:r>
-        <w:t>Date:</w:t>
+        <w:rPr>
+          <w:rFonts w:ascii="Calibri" w:hAnsi="Calibri"/>
+          <w:b/>
+          <w:sz w:val="22"/>
+        </w:rPr>
+        <w:t xml:space="preserve">Date: </w:t>
+      </w:r>
+      <w:r>
+        <w:rPr>
+          <w:rFonts w:ascii="Calibri" w:hAnsi="Calibri"/>
+          <w:sz w:val="22"/>
+        </w:rPr>
+        <w:t>September 30, 2026</w:t>
       </w:r>
     </w:p>
-    <w:p/>
     <w:sectPr>
       <w:pgSz w:w="12240" w:h="15840"/>
       <w:pgMar w:top="426" w:right="1800" w:bottom="1440" w:left="1800" w:header="720" w:footer="720" w:gutter="0"/>

</xml_diff>

<commit_message>
fix: prepare audited submission corrections locally
</commit_message>
<xml_diff>
--- a/LangAI3.0_AI_Disclosure.docx
+++ b/LangAI3.0_AI_Disclosure.docx
@@ -4,976 +4,419 @@
   <w:body>
     <w:p>
       <w:pPr>
-        <w:spacing w:after="240"/>
+        <w:pStyle w:val="Heading1"/>
+        <w:jc w:val="center"/>
       </w:pPr>
       <w:r>
-        <w:rPr>
-          <w:rFonts w:ascii="Calibri" w:hAnsi="Calibri"/>
-          <w:b/>
-          <w:color w:val="70509B"/>
-          <w:sz w:val="40"/>
-        </w:rPr>
-        <w:t>AI Usage DISCLOSURE FORM</w:t>
+        <w:t>AI</w:t>
+      </w:r>
+      <w:r>
+        <w:t xml:space="preserve"> Usage</w:t>
+      </w:r>
+      <w:r>
+        <w:t xml:space="preserve"> DISCLOSURE FORM</w:t>
       </w:r>
     </w:p>
+    <w:p/>
     <w:p>
-      <w:pPr>
-        <w:spacing w:before="280" w:after="120"/>
-      </w:pPr>
       <w:r>
-        <w:rPr>
-          <w:rFonts w:ascii="Calibri" w:hAnsi="Calibri"/>
-          <w:b/>
-          <w:sz w:val="26"/>
-        </w:rPr>
         <w:t xml:space="preserve">1. </w:t>
       </w:r>
       <w:r>
         <w:rPr>
-          <w:rFonts w:ascii="Calibri" w:hAnsi="Calibri"/>
           <w:b/>
-          <w:color w:val="302C3C"/>
-          <w:sz w:val="26"/>
+          <w:bCs/>
         </w:rPr>
         <w:t>Team Details</w:t>
       </w:r>
     </w:p>
     <w:p>
-      <w:pPr>
-        <w:spacing w:after="60"/>
-      </w:pPr>
       <w:r>
-        <w:rPr>
-          <w:rFonts w:ascii="Calibri" w:hAnsi="Calibri"/>
-          <w:b/>
-          <w:sz w:val="22"/>
-        </w:rPr>
-        <w:t xml:space="preserve">Team Name: </w:t>
+        <w:t>Team Name: Doctors</w:t>
       </w:r>
       <w:r>
-        <w:rPr>
-          <w:rFonts w:ascii="Calibri" w:hAnsi="Calibri"/>
-          <w:sz w:val="22"/>
-        </w:rPr>
-        <w:t>Doctors</w:t>
+        <w:t xml:space="preserve"/>
       </w:r>
     </w:p>
     <w:p>
-      <w:pPr>
-        <w:spacing w:after="60"/>
-      </w:pPr>
       <w:r>
-        <w:rPr>
-          <w:rFonts w:ascii="Calibri" w:hAnsi="Calibri"/>
-          <w:b/>
-          <w:sz w:val="22"/>
-        </w:rPr>
-        <w:t xml:space="preserve">Project / Product Name: </w:t>
+        <w:t>Project / Product Name: CodeDoctor</w:t>
       </w:r>
       <w:r>
-        <w:rPr>
-          <w:rFonts w:ascii="Calibri" w:hAnsi="Calibri"/>
-          <w:sz w:val="22"/>
-        </w:rPr>
-        <w:t>CodeDoctor — Agentic Semantic and Structural Intelligence for Code Repositories</w:t>
+        <w:t xml:space="preserve"/>
       </w:r>
     </w:p>
     <w:p>
-      <w:pPr>
-        <w:spacing w:after="60"/>
-      </w:pPr>
       <w:r>
-        <w:rPr>
-          <w:rFonts w:ascii="Calibri" w:hAnsi="Calibri"/>
-          <w:b/>
-          <w:sz w:val="22"/>
-        </w:rPr>
-        <w:t xml:space="preserve">Organization / Institution (if any): </w:t>
+        <w:t>Organization / Institution (if any): Vellore Institute of Technology Vellore</w:t>
       </w:r>
       <w:r>
-        <w:rPr>
-          <w:rFonts w:ascii="Calibri" w:hAnsi="Calibri"/>
-          <w:sz w:val="22"/>
-        </w:rPr>
-        <w:t>Vellore Institute of Technology (VIT), Vellore</w:t>
+        <w:t xml:space="preserve"/>
       </w:r>
     </w:p>
     <w:p>
-      <w:pPr>
-        <w:spacing w:after="60"/>
-      </w:pPr>
       <w:r>
-        <w:rPr>
-          <w:rFonts w:ascii="Calibri" w:hAnsi="Calibri"/>
-          <w:b/>
-          <w:sz w:val="22"/>
-        </w:rPr>
-        <w:t xml:space="preserve">Submission Date: </w:t>
+        <w:t>Submission Date:</w:t>
       </w:r>
       <w:r>
-        <w:rPr>
-          <w:rFonts w:ascii="Calibri" w:hAnsi="Calibri"/>
-          <w:sz w:val="22"/>
-        </w:rPr>
-        <w:t>September 30, 2026</w:t>
+        <w:t xml:space="preserve"> _______________________</w:t>
       </w:r>
     </w:p>
+    <w:p/>
     <w:p>
-      <w:pPr>
-        <w:spacing w:before="280" w:after="120"/>
-      </w:pPr>
       <w:r>
-        <w:rPr>
-          <w:rFonts w:ascii="Calibri" w:hAnsi="Calibri"/>
-          <w:b/>
-          <w:sz w:val="26"/>
-        </w:rPr>
         <w:t xml:space="preserve">2. </w:t>
       </w:r>
       <w:r>
         <w:rPr>
-          <w:rFonts w:ascii="Calibri" w:hAnsi="Calibri"/>
           <w:b/>
-          <w:color w:val="302C3C"/>
-          <w:sz w:val="26"/>
+          <w:bCs/>
         </w:rPr>
         <w:t>AI Usage Declaration</w:t>
       </w:r>
     </w:p>
     <w:p>
-      <w:pPr>
-        <w:spacing w:after="60"/>
-      </w:pPr>
       <w:r>
-        <w:rPr>
-          <w:rFonts w:ascii="Calibri" w:hAnsi="Calibri"/>
-          <w:b/>
-          <w:sz w:val="22"/>
-        </w:rPr>
-        <w:t xml:space="preserve">Did your team use any Artificial Intelligence (AI) in developing this project?: </w:t>
+        <w:t>Did your team use any Artificial Intelligence (AI) in developing this project? Yes</w:t>
       </w:r>
       <w:r>
-        <w:rPr>
-          <w:rFonts w:ascii="Calibri" w:hAnsi="Calibri"/>
-          <w:sz w:val="22"/>
-        </w:rPr>
-        <w:t>Yes</w:t>
+        <w:t xml:space="preserve"/>
+      </w:r>
+      <w:r>
+        <w:t xml:space="preserve"/>
+      </w:r>
+      <w:r>
+        <w:t xml:space="preserve"/>
+      </w:r>
+      <w:r>
+        <w:t/>
       </w:r>
     </w:p>
     <w:p>
-      <w:pPr>
-        <w:spacing w:after="80"/>
-      </w:pPr>
       <w:r>
-        <w:rPr>
-          <w:rFonts w:ascii="Calibri" w:hAnsi="Calibri"/>
-          <w:i w:val="0"/>
-          <w:sz w:val="22"/>
-        </w:rPr>
-        <w:t>Declaration Summary: AI tools (Antigravity IDE, Claude 3.5 Sonnet, OpenAI Codex) were utilized as interactive pair-programming assistants during project development. AI assisted with architectural ideation, boilerplate code scaffolding, Tree-sitter AST visitor logic, unit test fixture generation, and technical documentation drafting. All core architectural gating, mathematical scoring formulas (Reciprocal Rank Fusion k=60, escalation margin Δ=0.004), content-addressed SQLite cache schemas, and experimental validation gates were designed, evaluated, and verified by the team.</w:t>
+        <w:t>OpenAI Codex assisted with the current repository review, code and documentation corrections, evidence checks and disclosure preparation. Earlier project records also name Claude and Antigravity IDE; exact versions, feature attribution and human modifications require team confirmation. This form does not certify those earlier attributions or supply a representative's consent.</w:t>
       </w:r>
     </w:p>
+    <w:p/>
     <w:p>
-      <w:pPr>
-        <w:spacing w:before="280" w:after="120"/>
-      </w:pPr>
       <w:r>
-        <w:rPr>
-          <w:rFonts w:ascii="Calibri" w:hAnsi="Calibri"/>
-          <w:b/>
-          <w:sz w:val="26"/>
-        </w:rPr>
         <w:t xml:space="preserve">3. </w:t>
       </w:r>
       <w:r>
         <w:rPr>
-          <w:rFonts w:ascii="Calibri" w:hAnsi="Calibri"/>
           <w:b/>
-          <w:color w:val="302C3C"/>
-          <w:sz w:val="26"/>
+          <w:bCs/>
         </w:rPr>
-        <w:t>Purpose of AI Usage (Brief Details)</w:t>
+        <w:t>Purpose of AI Usage</w:t>
+      </w:r>
+      <w:r>
+        <w:rPr>
+          <w:b/>
+          <w:bCs/>
+        </w:rPr>
+        <w:t xml:space="preserve"> </w:t>
+      </w:r>
+      <w:proofErr w:type="gramStart"/>
+      <w:r>
+        <w:rPr>
+          <w:b/>
+          <w:bCs/>
+        </w:rPr>
+        <w:t xml:space="preserve">( </w:t>
+      </w:r>
+      <w:r>
+        <w:rPr>
+          <w:b/>
+          <w:bCs/>
+        </w:rPr>
+        <w:t>B</w:t>
+      </w:r>
+      <w:r>
+        <w:rPr>
+          <w:b/>
+          <w:bCs/>
+        </w:rPr>
+        <w:t>rief</w:t>
+      </w:r>
+      <w:proofErr w:type="gramEnd"/>
+      <w:r>
+        <w:rPr>
+          <w:b/>
+          <w:bCs/>
+        </w:rPr>
+        <w:t xml:space="preserve"> Details)</w:t>
       </w:r>
     </w:p>
     <w:p>
-      <w:pPr>
-        <w:spacing w:after="60"/>
-      </w:pPr>
       <w:r>
-        <w:rPr>
-          <w:rFonts w:ascii="Calibri" w:hAnsi="Calibri"/>
-          <w:b/>
-          <w:sz w:val="22"/>
-        </w:rPr>
-        <w:t xml:space="preserve">Idea generation / brainstorming: </w:t>
+        <w:t xml:space="preserve">Idea generation / brainstorming: AI-assisted retrieval and verification design review.</w:t>
+      </w:r>
+      <w:proofErr w:type="gramStart"/>
+      <w:r>
+        <w:t/>
       </w:r>
       <w:r>
-        <w:rPr>
-          <w:rFonts w:ascii="Calibri" w:hAnsi="Calibri"/>
-          <w:sz w:val="22"/>
-        </w:rPr>
-        <w:t>Explored multi-signal code retrieval architectures, evidence-gated query routing mechanisms, and AST statement-boundary chunking strategies to minimize CPU query latency under Samsung constraints.</w:t>
+        <w:t xml:space="preserve"/>
+      </w:r>
+      <w:proofErr w:type="gramEnd"/>
+      <w:r>
+        <w:t/>
       </w:r>
     </w:p>
     <w:p>
-      <w:pPr>
-        <w:spacing w:after="60"/>
-      </w:pPr>
       <w:r>
-        <w:rPr>
-          <w:rFonts w:ascii="Calibri" w:hAnsi="Calibri"/>
-          <w:b/>
-          <w:sz w:val="22"/>
-        </w:rPr>
-        <w:t xml:space="preserve">Code generation or assistance: </w:t>
+        <w:t>Code generation or assistance: Repository fixes, scripts and test assistance; attribution review pending.</w:t>
       </w:r>
       <w:r>
-        <w:rPr>
-          <w:rFonts w:ascii="Calibri" w:hAnsi="Calibri"/>
-          <w:sz w:val="22"/>
-        </w:rPr>
-        <w:t>Assisted in writing boilerplate scaffolding, Tree-sitter AST visitor patterns, SQLite content-addressed caching methods (EmbeddingCache), and pytest test fixtures.</w:t>
+        <w:t xml:space="preserve"/>
       </w:r>
     </w:p>
     <w:p>
-      <w:pPr>
-        <w:spacing w:after="60"/>
-      </w:pPr>
       <w:r>
-        <w:rPr>
-          <w:rFonts w:ascii="Calibri" w:hAnsi="Calibri"/>
-          <w:b/>
-          <w:sz w:val="22"/>
-        </w:rPr>
-        <w:t xml:space="preserve">UI / UX design: </w:t>
+        <w:t>UI / UX design: Earlier records report workbench assistance; detailed attribution pending.</w:t>
       </w:r>
       <w:r>
-        <w:rPr>
-          <w:rFonts w:ascii="Calibri" w:hAnsi="Calibri"/>
-          <w:sz w:val="22"/>
-        </w:rPr>
-        <w:t>Assisted in structuring the local developer web workbench (web/dist/index.html and explorer.html), SVG icon alignments, and dark-mode CSS styling.</w:t>
+        <w:t xml:space="preserve"/>
       </w:r>
     </w:p>
     <w:p>
-      <w:pPr>
-        <w:spacing w:after="60"/>
-      </w:pPr>
       <w:r>
-        <w:rPr>
-          <w:rFonts w:ascii="Calibri" w:hAnsi="Calibri"/>
-          <w:b/>
-          <w:sz w:val="22"/>
-        </w:rPr>
-        <w:t xml:space="preserve">Content creation: </w:t>
+        <w:t>Content creation: Technical documentation, submission materials and disclosure draft.</w:t>
       </w:r>
       <w:r>
-        <w:rPr>
-          <w:rFonts w:ascii="Calibri" w:hAnsi="Calibri"/>
-          <w:sz w:val="22"/>
-        </w:rPr>
-        <w:t>Assisted in drafting technical documentation (README.md, PROTOCOL.md), slide bullet points, and AI disclosure statements.</w:t>
+        <w:t xml:space="preserve"/>
       </w:r>
     </w:p>
     <w:p>
-      <w:pPr>
-        <w:spacing w:after="60"/>
-      </w:pPr>
       <w:r>
-        <w:rPr>
-          <w:rFonts w:ascii="Calibri" w:hAnsi="Calibri"/>
-          <w:b/>
-          <w:sz w:val="22"/>
-        </w:rPr>
-        <w:t xml:space="preserve">Data analysis: </w:t>
+        <w:t>Data analysis: Inspection of raw evaluation evidence and synthetic fixture limitations.</w:t>
       </w:r>
       <w:r>
-        <w:rPr>
-          <w:rFonts w:ascii="Calibri" w:hAnsi="Calibri"/>
-          <w:sz w:val="22"/>
-        </w:rPr>
-        <w:t>Assisted in analyzing MTEB evaluation logs, computing paired-bootstrap statistical significance distributions, and evaluating Kaggle Intel Xeon CPU runtime profiles.</w:t>
+        <w:t xml:space="preserve"/>
       </w:r>
     </w:p>
     <w:p>
-      <w:pPr>
-        <w:spacing w:after="60"/>
-      </w:pPr>
       <w:r>
-        <w:rPr>
-          <w:rFonts w:ascii="Calibri" w:hAnsi="Calibri"/>
-          <w:b/>
-          <w:sz w:val="22"/>
-        </w:rPr>
-        <w:t xml:space="preserve">Testing / debugging: </w:t>
+        <w:t>Testing / debugging: Test execution and failure diagnosis; checks are recorded separately.</w:t>
       </w:r>
       <w:r>
-        <w:rPr>
-          <w:rFonts w:ascii="Calibri" w:hAnsi="Calibri"/>
-          <w:sz w:val="22"/>
-        </w:rPr>
-        <w:t>Assisted in debugging test fixture assertions (e.g., scripts/validate_hands_on.py line 136 index-overwrite bug) and diagnosing cross-platform Windows/macOS subprocess isolation edge cases.</w:t>
+        <w:t xml:space="preserve"/>
       </w:r>
     </w:p>
     <w:p>
+      <w:r>
+        <w:t>Other: Dependency, configuration and reproducibility review.</w:t>
+      </w:r>
+      <w:r>
+        <w:t xml:space="preserve"/>
+      </w:r>
+    </w:p>
+    <w:p/>
+    <w:p>
       <w:pPr>
-        <w:spacing w:after="60"/>
+        <w:keepNext/>
       </w:pPr>
       <w:r>
-        <w:rPr>
-          <w:rFonts w:ascii="Calibri" w:hAnsi="Calibri"/>
-          <w:b/>
-          <w:sz w:val="22"/>
-        </w:rPr>
-        <w:t xml:space="preserve">Other: </w:t>
-      </w:r>
-      <w:r>
-        <w:rPr>
-          <w:rFonts w:ascii="Calibri" w:hAnsi="Calibri"/>
-          <w:sz w:val="22"/>
-        </w:rPr>
-        <w:t>Assisted in authoring Kaggle multi-stage evaluation kernel scripts and GitHub Actions CI matrix workflow configurations.</w:t>
-      </w:r>
-    </w:p>
-    <w:p>
-      <w:pPr>
-        <w:spacing w:before="280" w:after="120"/>
-      </w:pPr>
-      <w:r>
-        <w:rPr>
-          <w:rFonts w:ascii="Calibri" w:hAnsi="Calibri"/>
-          <w:b/>
-          <w:sz w:val="26"/>
-        </w:rPr>
         <w:t xml:space="preserve">4. </w:t>
       </w:r>
       <w:r>
         <w:rPr>
-          <w:rFonts w:ascii="Calibri" w:hAnsi="Calibri"/>
           <w:b/>
-          <w:color w:val="302C3C"/>
-          <w:sz w:val="26"/>
+          <w:bCs/>
         </w:rPr>
         <w:t>Feature Origin Classification</w:t>
       </w:r>
       <w:r>
         <w:rPr>
-          <w:rFonts w:ascii="Calibri" w:hAnsi="Calibri"/>
-          <w:i/>
-          <w:color w:val="666666"/>
-          <w:sz w:val="22"/>
+          <w:b/>
+          <w:bCs/>
         </w:rPr>
-        <w:t xml:space="preserve"> (Please add/delete based on the number of the feature)</w:t>
+        <w:t xml:space="preserve"> </w:t>
+      </w:r>
+      <w:proofErr w:type="gramStart"/>
+      <w:r>
+        <w:rPr>
+          <w:b/>
+          <w:bCs/>
+        </w:rPr>
+        <w:t>( Please</w:t>
+      </w:r>
+      <w:proofErr w:type="gramEnd"/>
+      <w:r>
+        <w:rPr>
+          <w:b/>
+          <w:bCs/>
+        </w:rPr>
+        <w:t xml:space="preserve"> add/delete based on the number of the feature)</w:t>
       </w:r>
     </w:p>
     <w:p>
       <w:pPr>
-        <w:spacing w:before="160" w:after="40"/>
+        <w:keepNext/>
       </w:pPr>
       <w:r>
-        <w:rPr>
-          <w:rFonts w:ascii="Calibri" w:hAnsi="Calibri"/>
-          <w:b/>
-          <w:color w:val="70509B"/>
-          <w:sz w:val="22"/>
-        </w:rPr>
-        <w:t>Feature 1: Evidence-Gated Agentic Query Router (app/agent/router.py)</w:t>
+        <w:t>1. Feature Name: Retrieval pipeline and repository workbench</w:t>
       </w:r>
     </w:p>
     <w:p>
       <w:pPr>
-        <w:spacing w:after="60"/>
+        <w:keepNext/>
       </w:pPr>
       <w:r>
-        <w:rPr>
-          <w:rFonts w:ascii="Calibri" w:hAnsi="Calibri"/>
-          <w:b/>
-          <w:sz w:val="22"/>
-        </w:rPr>
-        <w:t xml:space="preserve">  1. Feature Name: </w:t>
+        <w:t>2. Self-Generated/AI-Generated/Both: Team classification pending</w:t>
       </w:r>
+    </w:p>
+    <w:p>
       <w:r>
-        <w:rPr>
-          <w:rFonts w:ascii="Calibri" w:hAnsi="Calibri"/>
-          <w:sz w:val="22"/>
-        </w:rPr>
-        <w:t>Evidence-Gated Agentic Query Router (app/agent/router.py)</w:t>
+        <w:t xml:space="preserve">3. Description (AI tools/platform Used, prompt used, Output Summary, Modification): Earlier records name Claude, Antigravity IDE and OpenAI Codex. Request summary (not a verbatim prompt): assist code retrieval, caching, verification and the workbench. Output summary: the repository contains these implementations and tests. Exact prompts and feature-specific authorship are not established by the records inspected here. Human modifications and final classification must be completed by the team.</w:t>
+      </w:r>
+      <w:proofErr w:type="gramStart"/>
+      <w:r>
+        <w:t/>
+      </w:r>
+      <w:proofErr w:type="gramEnd"/>
+      <w:r>
+        <w:t xml:space="preserve"/>
+      </w:r>
+    </w:p>
+    <w:p/>
+    <w:p>
+      <w:pPr>
+        <w:keepNext/>
+      </w:pPr>
+      <w:r>
+        <w:lastRenderedPageBreak/>
+        <w:t>1. Feature Name: Current submission corrections and disclosure generation</w:t>
       </w:r>
     </w:p>
     <w:p>
       <w:pPr>
-        <w:spacing w:after="60"/>
+        <w:keepNext/>
       </w:pPr>
       <w:r>
-        <w:rPr>
-          <w:rFonts w:ascii="Calibri" w:hAnsi="Calibri"/>
-          <w:b/>
-          <w:sz w:val="22"/>
-        </w:rPr>
-        <w:t xml:space="preserve">  2. Self-Generated/AI-Generated/Both: </w:t>
+        <w:t>2. Self-Generated/AI-Generated/Both: AI-assisted; team classification pending</w:t>
+      </w:r>
+    </w:p>
+    <w:p>
+      <w:r>
+        <w:t xml:space="preserve">3. Description (AI tools/platform Used, prompt used, Output Summary, Modification): AI tools: OpenAI Codex; local openai/whisper-tiny.en ASR through Transformers. Request summary (not a verbatim prompt): review requirements, correct claims, preserve evidence and the form, and prepare a shorter demo. Output summary: local code, docs, dependency and disclosure corrections; provisional transcript and timestamps from local ASR and an FFmpeg cut-only video preview. No audio was uploaded for ASR. The transcript, cuts, narration, human modifications and final acceptance require team review.</w:t>
+      </w:r>
+      <w:r>
+        <w:t/>
+      </w:r>
+      <w:proofErr w:type="gramStart"/>
+      <w:r>
+        <w:t/>
+      </w:r>
+      <w:r>
+        <w:t xml:space="preserve"/>
+      </w:r>
+      <w:proofErr w:type="gramEnd"/>
+      <w:r>
+        <w:t xml:space="preserve"/>
+      </w:r>
+    </w:p>
+    <w:p>
+      <w:r>
+        <w:t/>
+      </w:r>
+    </w:p>
+    <w:p/>
+    <w:p>
+      <w:r>
+        <w:t>5</w:t>
+      </w:r>
+      <w:r>
+        <w:t xml:space="preserve">. </w:t>
       </w:r>
       <w:r>
         <w:rPr>
-          <w:rFonts w:ascii="Calibri" w:hAnsi="Calibri"/>
-          <w:sz w:val="22"/>
-        </w:rPr>
-        <w:t>Both</w:t>
-      </w:r>
-    </w:p>
-    <w:p>
-      <w:pPr>
-        <w:spacing w:after="60"/>
-      </w:pPr>
-      <w:r>
-        <w:rPr>
-          <w:rFonts w:ascii="Calibri" w:hAnsi="Calibri"/>
           <w:b/>
-          <w:sz w:val="22"/>
-        </w:rPr>
-        <w:t xml:space="preserve">  3. Description: </w:t>
-      </w:r>
-      <w:r>
-        <w:rPr>
-          <w:rFonts w:ascii="Calibri" w:hAnsi="Calibri"/>
-          <w:sz w:val="22"/>
-        </w:rPr>
-        <w:t>AI Tools Used: Antigravity / Claude 3.5 Sonnet / Codex | Prompt: "Design a query router that runs free passes (inverted index, BM25) first, defers expensive dense models on symbol queries, and escalates to dense semantic search only when the RRF fused score margin between rank 1 and 2 is below 0.004." | Output Summary: Generated the initial routing state machine, RouterSignals dataclass, regex patterns for structural intent (who calls, what imports), and RetrievalPlan. | Human Modification: Hand-tuned the score margin threshold (Δ = 0.004), integrated microsecond worked-example presence checks, and added audit-ready decision reason logging.</w:t>
-      </w:r>
-    </w:p>
-    <w:p>
-      <w:pPr>
-        <w:spacing w:before="160" w:after="40"/>
-      </w:pPr>
-      <w:r>
-        <w:rPr>
-          <w:rFonts w:ascii="Calibri" w:hAnsi="Calibri"/>
-          <w:b/>
-          <w:color w:val="70509B"/>
-          <w:sz w:val="22"/>
-        </w:rPr>
-        <w:t>Feature 2: Invariant Recipe-Keyed Vector Cache (app/indexing/cache.py)</w:t>
-      </w:r>
-    </w:p>
-    <w:p>
-      <w:pPr>
-        <w:spacing w:after="60"/>
-      </w:pPr>
-      <w:r>
-        <w:rPr>
-          <w:rFonts w:ascii="Calibri" w:hAnsi="Calibri"/>
-          <w:b/>
-          <w:sz w:val="22"/>
-        </w:rPr>
-        <w:t xml:space="preserve">  1. Feature Name: </w:t>
-      </w:r>
-      <w:r>
-        <w:rPr>
-          <w:rFonts w:ascii="Calibri" w:hAnsi="Calibri"/>
-          <w:sz w:val="22"/>
-        </w:rPr>
-        <w:t>Invariant Recipe-Keyed Vector Cache (app/indexing/cache.py)</w:t>
-      </w:r>
-    </w:p>
-    <w:p>
-      <w:pPr>
-        <w:spacing w:after="60"/>
-      </w:pPr>
-      <w:r>
-        <w:rPr>
-          <w:rFonts w:ascii="Calibri" w:hAnsi="Calibri"/>
-          <w:b/>
-          <w:sz w:val="22"/>
-        </w:rPr>
-        <w:t xml:space="preserve">  2. Self-Generated/AI-Generated/Both: </w:t>
-      </w:r>
-      <w:r>
-        <w:rPr>
-          <w:rFonts w:ascii="Calibri" w:hAnsi="Calibri"/>
-          <w:sz w:val="22"/>
-        </w:rPr>
-        <w:t>Both</w:t>
-      </w:r>
-    </w:p>
-    <w:p>
-      <w:pPr>
-        <w:spacing w:after="60"/>
-      </w:pPr>
-      <w:r>
-        <w:rPr>
-          <w:rFonts w:ascii="Calibri" w:hAnsi="Calibri"/>
-          <w:b/>
-          <w:sz w:val="22"/>
-        </w:rPr>
-        <w:t xml:space="preserve">  3. Description: </w:t>
-      </w:r>
-      <w:r>
-        <w:rPr>
-          <w:rFonts w:ascii="Calibri" w:hAnsi="Calibri"/>
-          <w:sz w:val="22"/>
-        </w:rPr>
-        <w:t>AI Tools Used: Antigravity / Claude 3.5 Sonnet | Prompt: "Create a content-addressed SQLite embedding cache that keys on SHA-256 of model, commit revision, prompt, and chunk text while excluding file path and line numbers so moved functions don't re-embed." | Output Summary: Provided SQLite table schema, binary vector serialization/deserialization routines, and hash computation functions. | Human Modification: Added strict mode='document' vs mode='query' namespace isolation to prevent query-doc cache collisions, and verified bit-compatibility between GPU indexing and CPU retrieval (cosine &gt;= 0.9994).</w:t>
-      </w:r>
-    </w:p>
-    <w:p>
-      <w:pPr>
-        <w:spacing w:before="160" w:after="40"/>
-      </w:pPr>
-      <w:r>
-        <w:rPr>
-          <w:rFonts w:ascii="Calibri" w:hAnsi="Calibri"/>
-          <w:b/>
-          <w:color w:val="70509B"/>
-          <w:sz w:val="22"/>
-        </w:rPr>
-        <w:t>Feature 3: Tree-sitter AST Statement-Boundary Chunker (app/parser/chunker.py, edges.py)</w:t>
-      </w:r>
-    </w:p>
-    <w:p>
-      <w:pPr>
-        <w:spacing w:after="60"/>
-      </w:pPr>
-      <w:r>
-        <w:rPr>
-          <w:rFonts w:ascii="Calibri" w:hAnsi="Calibri"/>
-          <w:b/>
-          <w:sz w:val="22"/>
-        </w:rPr>
-        <w:t xml:space="preserve">  1. Feature Name: </w:t>
-      </w:r>
-      <w:r>
-        <w:rPr>
-          <w:rFonts w:ascii="Calibri" w:hAnsi="Calibri"/>
-          <w:sz w:val="22"/>
-        </w:rPr>
-        <w:t>Tree-sitter AST Statement-Boundary Chunker (app/parser/chunker.py, edges.py)</w:t>
-      </w:r>
-    </w:p>
-    <w:p>
-      <w:pPr>
-        <w:spacing w:after="60"/>
-      </w:pPr>
-      <w:r>
-        <w:rPr>
-          <w:rFonts w:ascii="Calibri" w:hAnsi="Calibri"/>
-          <w:b/>
-          <w:sz w:val="22"/>
-        </w:rPr>
-        <w:t xml:space="preserve">  2. Self-Generated/AI-Generated/Both: </w:t>
-      </w:r>
-      <w:r>
-        <w:rPr>
-          <w:rFonts w:ascii="Calibri" w:hAnsi="Calibri"/>
-          <w:sz w:val="22"/>
-        </w:rPr>
-        <w:t>Both</w:t>
-      </w:r>
-    </w:p>
-    <w:p>
-      <w:pPr>
-        <w:spacing w:after="60"/>
-      </w:pPr>
-      <w:r>
-        <w:rPr>
-          <w:rFonts w:ascii="Calibri" w:hAnsi="Calibri"/>
-          <w:b/>
-          <w:sz w:val="22"/>
-        </w:rPr>
-        <w:t xml:space="preserve">  3. Description: </w:t>
-      </w:r>
-      <w:r>
-        <w:rPr>
-          <w:rFonts w:ascii="Calibri" w:hAnsi="Calibri"/>
-          <w:sz w:val="22"/>
-        </w:rPr>
-        <w:t>AI Tools Used: Antigravity / Codex | Prompt: "Implement Tree-sitter chunking for Python and JavaScript/TypeScript that splits oversized functions strictly at top-level statement boundaries rather than arbitrary character/token cutoffs." | Output Summary: Generated AST grammar bindings, declaration header signature extractors, and _split_oversized_function statement traversal logic. | Human Modification: Enforced strict boundary conditions for Python def/class headers and JS arrow functions; added StructuralExtractor for call and import edge resolution with VERIFIED vs CANDIDATE confidence tags.</w:t>
-      </w:r>
-    </w:p>
-    <w:p>
-      <w:pPr>
-        <w:spacing w:before="160" w:after="40"/>
-      </w:pPr>
-      <w:r>
-        <w:rPr>
-          <w:rFonts w:ascii="Calibri" w:hAnsi="Calibri"/>
-          <w:b/>
-          <w:color w:val="70509B"/>
-          <w:sz w:val="22"/>
-        </w:rPr>
-        <w:t>Feature 4: Defensive Behavioral Execution Sandbox (app/pipeline/execution_rerank.py)</w:t>
-      </w:r>
-    </w:p>
-    <w:p>
-      <w:pPr>
-        <w:spacing w:after="60"/>
-      </w:pPr>
-      <w:r>
-        <w:rPr>
-          <w:rFonts w:ascii="Calibri" w:hAnsi="Calibri"/>
-          <w:b/>
-          <w:sz w:val="22"/>
-        </w:rPr>
-        <w:t xml:space="preserve">  1. Feature Name: </w:t>
-      </w:r>
-      <w:r>
-        <w:rPr>
-          <w:rFonts w:ascii="Calibri" w:hAnsi="Calibri"/>
-          <w:sz w:val="22"/>
-        </w:rPr>
-        <w:t>Defensive Behavioral Execution Sandbox (app/pipeline/execution_rerank.py)</w:t>
-      </w:r>
-    </w:p>
-    <w:p>
-      <w:pPr>
-        <w:spacing w:after="60"/>
-      </w:pPr>
-      <w:r>
-        <w:rPr>
-          <w:rFonts w:ascii="Calibri" w:hAnsi="Calibri"/>
-          <w:b/>
-          <w:sz w:val="22"/>
-        </w:rPr>
-        <w:t xml:space="preserve">  2. Self-Generated/AI-Generated/Both: </w:t>
-      </w:r>
-      <w:r>
-        <w:rPr>
-          <w:rFonts w:ascii="Calibri" w:hAnsi="Calibri"/>
-          <w:sz w:val="22"/>
-        </w:rPr>
-        <w:t>Both</w:t>
-      </w:r>
-    </w:p>
-    <w:p>
-      <w:pPr>
-        <w:spacing w:after="60"/>
-      </w:pPr>
-      <w:r>
-        <w:rPr>
-          <w:rFonts w:ascii="Calibri" w:hAnsi="Calibri"/>
-          <w:b/>
-          <w:sz w:val="22"/>
-        </w:rPr>
-        <w:t xml:space="preserve">  3. Description: </w:t>
-      </w:r>
-      <w:r>
-        <w:rPr>
-          <w:rFonts w:ascii="Calibri" w:hAnsi="Calibri"/>
-          <w:sz w:val="22"/>
-        </w:rPr>
-        <w:t>AI Tools Used: Antigravity / Claude 3.5 Sonnet | Prompt: "Implement an execution-based reranker that parses worked examples from competitive programming problems and runs candidate code in an isolated subprocess with timeout and memory limits." | Output Summary: Produced regex parsers for Codeforces/AtCoder I/O blocks, temporary directory runner script generation, and subprocess timeout handling. | Human Modification: Safety overhaul: moved setrlimit inside the child runner after exec to eliminate PyTorch multi-threading fork deadlocks and macOS kernel crashes; added floating-point tolerance (1e-06) and whitespace-invariant token matching (+0.02802 NDCG@10 lift).</w:t>
-      </w:r>
-    </w:p>
-    <w:p>
-      <w:pPr>
-        <w:spacing w:before="160" w:after="40"/>
-      </w:pPr>
-      <w:r>
-        <w:rPr>
-          <w:rFonts w:ascii="Calibri" w:hAnsi="Calibri"/>
-          <w:b/>
-          <w:color w:val="70509B"/>
-          <w:sz w:val="22"/>
-        </w:rPr>
-        <w:t>Feature 5: Lineage-Based Evolutionary Disambiguation (app/indexing/lineage.py, versioned.py)</w:t>
-      </w:r>
-    </w:p>
-    <w:p>
-      <w:pPr>
-        <w:spacing w:after="60"/>
-      </w:pPr>
-      <w:r>
-        <w:rPr>
-          <w:rFonts w:ascii="Calibri" w:hAnsi="Calibri"/>
-          <w:b/>
-          <w:sz w:val="22"/>
-        </w:rPr>
-        <w:t xml:space="preserve">  1. Feature Name: </w:t>
-      </w:r>
-      <w:r>
-        <w:rPr>
-          <w:rFonts w:ascii="Calibri" w:hAnsi="Calibri"/>
-          <w:sz w:val="22"/>
-        </w:rPr>
-        <w:t>Lineage-Based Evolutionary Disambiguation (app/indexing/lineage.py, versioned.py)</w:t>
-      </w:r>
-    </w:p>
-    <w:p>
-      <w:pPr>
-        <w:spacing w:after="60"/>
-      </w:pPr>
-      <w:r>
-        <w:rPr>
-          <w:rFonts w:ascii="Calibri" w:hAnsi="Calibri"/>
-          <w:b/>
-          <w:sz w:val="22"/>
-        </w:rPr>
-        <w:t xml:space="preserve">  2. Self-Generated/AI-Generated/Both: </w:t>
-      </w:r>
-      <w:r>
-        <w:rPr>
-          <w:rFonts w:ascii="Calibri" w:hAnsi="Calibri"/>
-          <w:sz w:val="22"/>
-        </w:rPr>
-        <w:t>Both</w:t>
-      </w:r>
-    </w:p>
-    <w:p>
-      <w:pPr>
-        <w:spacing w:after="60"/>
-      </w:pPr>
-      <w:r>
-        <w:rPr>
-          <w:rFonts w:ascii="Calibri" w:hAnsi="Calibri"/>
-          <w:b/>
-          <w:sz w:val="22"/>
-        </w:rPr>
-        <w:t xml:space="preserve">  3. Description: </w:t>
-      </w:r>
-      <w:r>
-        <w:rPr>
-          <w:rFonts w:ascii="Calibri" w:hAnsi="Calibri"/>
-          <w:sz w:val="22"/>
-        </w:rPr>
-        <w:t>AI Tools Used: Antigravity / Claude 3.5 Sonnet | Prompt: "Design a multi-version indexer that clusters evolving function variants across Git commit history and ranks them using execution verification against test cases." | Output Summary: Generated Git commit history traversal, k=5 token shingle hashing, and Jaccard similarity clustering algorithms. | Human Modification: Integrated execution-first ranking logic within lineages, achieving 100% correct variant selection across 12 test lineages on Kaggle Xeon CPU (vs 8.33% for raw dense retrieval).</w:t>
-      </w:r>
-    </w:p>
-    <w:p>
-      <w:pPr>
-        <w:spacing w:before="160" w:after="40"/>
-      </w:pPr>
-      <w:r>
-        <w:rPr>
-          <w:rFonts w:ascii="Calibri" w:hAnsi="Calibri"/>
-          <w:b/>
-          <w:color w:val="70509B"/>
-          <w:sz w:val="22"/>
-        </w:rPr>
-        <w:t>Feature 6: Local Repository Workbench &amp; FastAPI Service (app/workbench.py, app/server.py)</w:t>
-      </w:r>
-    </w:p>
-    <w:p>
-      <w:pPr>
-        <w:spacing w:after="60"/>
-      </w:pPr>
-      <w:r>
-        <w:rPr>
-          <w:rFonts w:ascii="Calibri" w:hAnsi="Calibri"/>
-          <w:b/>
-          <w:sz w:val="22"/>
-        </w:rPr>
-        <w:t xml:space="preserve">  1. Feature Name: </w:t>
-      </w:r>
-      <w:r>
-        <w:rPr>
-          <w:rFonts w:ascii="Calibri" w:hAnsi="Calibri"/>
-          <w:sz w:val="22"/>
-        </w:rPr>
-        <w:t>Local Repository Workbench &amp; FastAPI Service (app/workbench.py, app/server.py)</w:t>
-      </w:r>
-    </w:p>
-    <w:p>
-      <w:pPr>
-        <w:spacing w:after="60"/>
-      </w:pPr>
-      <w:r>
-        <w:rPr>
-          <w:rFonts w:ascii="Calibri" w:hAnsi="Calibri"/>
-          <w:b/>
-          <w:sz w:val="22"/>
-        </w:rPr>
-        <w:t xml:space="preserve">  2. Self-Generated/AI-Generated/Both: </w:t>
-      </w:r>
-      <w:r>
-        <w:rPr>
-          <w:rFonts w:ascii="Calibri" w:hAnsi="Calibri"/>
-          <w:sz w:val="22"/>
-        </w:rPr>
-        <w:t>Both</w:t>
-      </w:r>
-    </w:p>
-    <w:p>
-      <w:pPr>
-        <w:spacing w:after="60"/>
-      </w:pPr>
-      <w:r>
-        <w:rPr>
-          <w:rFonts w:ascii="Calibri" w:hAnsi="Calibri"/>
-          <w:b/>
-          <w:sz w:val="22"/>
-        </w:rPr>
-        <w:t xml:space="preserve">  3. Description: </w:t>
-      </w:r>
-      <w:r>
-        <w:rPr>
-          <w:rFonts w:ascii="Calibri" w:hAnsi="Calibri"/>
-          <w:sz w:val="22"/>
-        </w:rPr>
-        <w:t>AI Tools Used: Antigravity / Claude 3.5 Sonnet | Prompt: "Create a FastAPI backend and workbench orchestrator that serves multi-signal code search, exposes transparent additive RRF arithmetic, and displays retrieval decision reasons." | Output Summary: Built FastAPI endpoint routes, Workbench orchestration class, and JSON schema response models. | Human Modification: Enforced the zero-vector attention cap for oversized chunks (&gt;6000 chars) to prevent corrupt interior-token pooling in last-token models; implemented test-split access budgeting to prevent data contamination.</w:t>
-      </w:r>
-    </w:p>
-    <w:p>
-      <w:pPr>
-        <w:spacing w:before="280" w:after="120"/>
-      </w:pPr>
-      <w:r>
-        <w:rPr>
-          <w:rFonts w:ascii="Calibri" w:hAnsi="Calibri"/>
-          <w:b/>
-          <w:sz w:val="26"/>
-        </w:rPr>
-        <w:t xml:space="preserve">5. </w:t>
-      </w:r>
-      <w:r>
-        <w:rPr>
-          <w:rFonts w:ascii="Calibri" w:hAnsi="Calibri"/>
-          <w:b/>
-          <w:color w:val="302C3C"/>
-          <w:sz w:val="26"/>
+          <w:bCs/>
         </w:rPr>
         <w:t>Ethical &amp; Compliance Confirmation</w:t>
       </w:r>
     </w:p>
     <w:p>
-      <w:pPr>
-        <w:spacing w:after="60"/>
-      </w:pPr>
       <w:r>
-        <w:rPr>
-          <w:rFonts w:ascii="Calibri" w:hAnsi="Calibri"/>
-          <w:b/>
-          <w:sz w:val="22"/>
-        </w:rPr>
-        <w:t xml:space="preserve">AI usage complies with guidelines and policies: </w:t>
+        <w:t>AI usage complies with guidelines and policies. Pending human confirmation</w:t>
+      </w:r>
+      <w:r>
+        <w:t xml:space="preserve"/>
       </w:r>
       <w:r>
         <w:rPr>
-          <w:rFonts w:ascii="Calibri" w:hAnsi="Calibri"/>
-          <w:sz w:val="22"/>
+          <w:b/>
+          <w:bCs/>
         </w:rPr>
-        <w:t>Yes</w:t>
+        <w:t/>
       </w:r>
     </w:p>
     <w:p>
-      <w:pPr>
-        <w:spacing w:after="60"/>
-      </w:pPr>
       <w:r>
-        <w:rPr>
-          <w:rFonts w:ascii="Calibri" w:hAnsi="Calibri"/>
-          <w:b/>
-          <w:sz w:val="22"/>
-        </w:rPr>
-        <w:t xml:space="preserve">No proprietary or copyrighted data misused: </w:t>
+        <w:t>No proprietary or copyrighted data misused. Pending human confirmation</w:t>
+      </w:r>
+      <w:r>
+        <w:t xml:space="preserve"/>
       </w:r>
       <w:r>
         <w:rPr>
-          <w:rFonts w:ascii="Calibri" w:hAnsi="Calibri"/>
-          <w:sz w:val="22"/>
+          <w:b/>
+          <w:bCs/>
         </w:rPr>
-        <w:t>I Agree</w:t>
-      </w:r>
-    </w:p>
-    <w:p>
-      <w:pPr>
-        <w:spacing w:before="280" w:after="120"/>
-      </w:pPr>
-      <w:r>
-        <w:rPr>
-          <w:rFonts w:ascii="Calibri" w:hAnsi="Calibri"/>
-          <w:b/>
-          <w:sz w:val="26"/>
-        </w:rPr>
-        <w:t xml:space="preserve">6. </w:t>
+        <w:t xml:space="preserve"/>
       </w:r>
       <w:r>
         <w:rPr>
-          <w:rFonts w:ascii="Calibri" w:hAnsi="Calibri"/>
           <w:b/>
-          <w:color w:val="302C3C"/>
-          <w:sz w:val="26"/>
+          <w:bCs/>
+        </w:rPr>
+        <w:t/>
+      </w:r>
+    </w:p>
+    <w:p/>
+    <w:p>
+      <w:pPr>
+        <w:rPr>
+          <w:b/>
+          <w:bCs/>
+        </w:rPr>
+      </w:pPr>
+      <w:r>
+        <w:t>6</w:t>
+      </w:r>
+      <w:r>
+        <w:t xml:space="preserve">. </w:t>
+      </w:r>
+      <w:r>
+        <w:rPr>
+          <w:b/>
+          <w:bCs/>
         </w:rPr>
         <w:t>Declaration &amp; Sign-Off</w:t>
       </w:r>
     </w:p>
     <w:p>
-      <w:pPr>
-        <w:spacing w:after="60"/>
-      </w:pPr>
       <w:r>
-        <w:rPr>
-          <w:rFonts w:ascii="Calibri" w:hAnsi="Calibri"/>
-          <w:b/>
-          <w:sz w:val="22"/>
-        </w:rPr>
-        <w:t xml:space="preserve">Name of Team Representative: </w:t>
-      </w:r>
-      <w:r>
-        <w:rPr>
-          <w:rFonts w:ascii="Calibri" w:hAnsi="Calibri"/>
-          <w:sz w:val="22"/>
-        </w:rPr>
-        <w:t>Manish H.</w:t>
+        <w:t>Name of Team Representative:</w:t>
       </w:r>
     </w:p>
     <w:p>
-      <w:pPr>
-        <w:spacing w:after="60"/>
-      </w:pPr>
       <w:r>
-        <w:rPr>
-          <w:rFonts w:ascii="Calibri" w:hAnsi="Calibri"/>
-          <w:b/>
-          <w:sz w:val="22"/>
-        </w:rPr>
-        <w:t xml:space="preserve">Role: </w:t>
-      </w:r>
-      <w:r>
-        <w:rPr>
-          <w:rFonts w:ascii="Calibri" w:hAnsi="Calibri"/>
-          <w:sz w:val="22"/>
-        </w:rPr>
-        <w:t>Team Lead / Full-Stack Developer</w:t>
+        <w:t>Role:</w:t>
       </w:r>
     </w:p>
     <w:p>
-      <w:pPr>
-        <w:spacing w:after="60"/>
-      </w:pPr>
       <w:r>
-        <w:rPr>
-          <w:rFonts w:ascii="Calibri" w:hAnsi="Calibri"/>
-          <w:b/>
-          <w:sz w:val="22"/>
-        </w:rPr>
-        <w:t xml:space="preserve">Signature: </w:t>
-      </w:r>
-      <w:r>
-        <w:rPr>
-          <w:rFonts w:ascii="Calibri" w:hAnsi="Calibri"/>
-          <w:sz w:val="22"/>
-        </w:rPr>
-        <w:t>Manish H. (Digitally Signed)</w:t>
+        <w:t>Signature:</w:t>
       </w:r>
     </w:p>
     <w:p>
-      <w:pPr>
-        <w:spacing w:after="60"/>
-      </w:pPr>
       <w:r>
-        <w:rPr>
-          <w:rFonts w:ascii="Calibri" w:hAnsi="Calibri"/>
-          <w:b/>
-          <w:sz w:val="22"/>
-        </w:rPr>
-        <w:t xml:space="preserve">Date: </w:t>
-      </w:r>
-      <w:r>
-        <w:rPr>
-          <w:rFonts w:ascii="Calibri" w:hAnsi="Calibri"/>
-          <w:sz w:val="22"/>
-        </w:rPr>
-        <w:t>September 30, 2026</w:t>
+        <w:t>Date:</w:t>
       </w:r>
     </w:p>
+    <w:p/>
     <w:sectPr>
       <w:pgSz w:w="12240" w:h="15840"/>
       <w:pgMar w:top="426" w:right="1800" w:bottom="1440" w:left="1800" w:header="720" w:footer="720" w:gutter="0"/>

</xml_diff>